<commit_message>
Store uploaded images in the database by default
Fixes 'Image storage is not configured' when no Vercel Blob token is set.
Blob remains preferred when configured, with database fallback. Large photos
are shrunk in the browser to fit the 4.5 MB host request limit.

Co-Authored-By: Claude Sonnet 5.5 <noreply@anthropic.com>
Claude-Session: https://claude.ai/code/session_01MvZWXEuvD6gpV2sZ3kzxhx
</commit_message>
<xml_diff>
--- a/docs/Moses-Studio-Backend-Guide.docx
+++ b/docs/Moses-Studio-Backend-Guide.docx
@@ -6960,7 +6960,7 @@
           <w:sz w:val="22"/>
           <w:szCs w:val="22"/>
         </w:rPr>
-        <w:t xml:space="preserve">Accepted files: JPG, PNG, WebP, AVIF and GIF. Maximum 8 MB each.</w:t>
+        <w:t xml:space="preserve">Accepted files: JPG, PNG, WebP, AVIF and GIF. Large photos (for example straight from a phone or camera) are shrunk automatically in your browser before upload, so you do not need to resize them yourself.</w:t>
       </w:r>
     </w:p>
     <w:p>
@@ -9905,7 +9905,7 @@
                 <w:sz w:val="20"/>
                 <w:szCs w:val="20"/>
               </w:rPr>
-              <w:t xml:space="preserve">Use JPG, PNG, WebP, AVIF or GIF under 8 MB. If every upload fails, the image storage connection on your hosting needs attention; contact your hosting administrator.</w:t>
+              <w:t xml:space="preserve">Use JPG, PNG, WebP, AVIF or GIF. Very large files are shrunk automatically; if an upload still fails, try a smaller or different file, and check your internet connection.</w:t>
             </w:r>
           </w:p>
         </w:tc>

</xml_diff>